<commit_message>
added portfolio link in word
</commit_message>
<xml_diff>
--- a/Satvik_Saluja_CV.docx
+++ b/Satvik_Saluja_CV.docx
@@ -122,8 +122,16 @@
         </w:r>
       </w:hyperlink>
       <w:r>
-        <w:t xml:space="preserve"> | Portfolio</w:t>
-      </w:r>
+        <w:t xml:space="preserve"> | </w:t>
+      </w:r>
+      <w:hyperlink r:id="rId8" w:history="1">
+        <w:r>
+          <w:rPr>
+            <w:rStyle w:val="Hyperlink"/>
+          </w:rPr>
+          <w:t>Portfolio</w:t>
+        </w:r>
+      </w:hyperlink>
     </w:p>
     <w:p>
       <w:pPr>
@@ -406,7 +414,7 @@
         </w:rPr>
         <w:t xml:space="preserve"> - </w:t>
       </w:r>
-      <w:hyperlink r:id="rId8" w:history="1">
+      <w:hyperlink r:id="rId9" w:history="1">
         <w:r>
           <w:rPr>
             <w:rStyle w:val="Hyperlink"/>
@@ -414,25 +422,7 @@
             <w:sz w:val="24"/>
             <w:szCs w:val="24"/>
           </w:rPr>
-          <w:t>Li</w:t>
-        </w:r>
-        <w:r>
-          <w:rPr>
-            <w:rStyle w:val="Hyperlink"/>
-            <w:rFonts w:ascii="Calibri" w:eastAsia="Calibri" w:hAnsi="Calibri" w:cs="Calibri"/>
-            <w:sz w:val="24"/>
-            <w:szCs w:val="24"/>
-          </w:rPr>
-          <w:t>n</w:t>
-        </w:r>
-        <w:r>
-          <w:rPr>
-            <w:rStyle w:val="Hyperlink"/>
-            <w:rFonts w:ascii="Calibri" w:eastAsia="Calibri" w:hAnsi="Calibri" w:cs="Calibri"/>
-            <w:sz w:val="24"/>
-            <w:szCs w:val="24"/>
-          </w:rPr>
-          <w:t>k</w:t>
+          <w:t>Link</w:t>
         </w:r>
       </w:hyperlink>
       <w:r>
@@ -443,7 +433,7 @@
         </w:rPr>
         <w:t xml:space="preserve"> | </w:t>
       </w:r>
-      <w:hyperlink r:id="rId9" w:history="1">
+      <w:hyperlink r:id="rId10" w:history="1">
         <w:r>
           <w:rPr>
             <w:rStyle w:val="Hyperlink"/>
@@ -651,7 +641,7 @@
         </w:rPr>
         <w:t xml:space="preserve"> </w:t>
       </w:r>
-      <w:hyperlink r:id="rId10" w:history="1">
+      <w:hyperlink r:id="rId11" w:history="1">
         <w:r>
           <w:rPr>
             <w:rStyle w:val="Hyperlink"/>
@@ -659,25 +649,7 @@
             <w:sz w:val="24"/>
             <w:szCs w:val="24"/>
           </w:rPr>
-          <w:t>L</w:t>
-        </w:r>
-        <w:r>
-          <w:rPr>
-            <w:rStyle w:val="Hyperlink"/>
-            <w:rFonts w:ascii="Calibri" w:eastAsia="Calibri" w:hAnsi="Calibri" w:cs="Calibri"/>
-            <w:sz w:val="24"/>
-            <w:szCs w:val="24"/>
-          </w:rPr>
-          <w:t>i</w:t>
-        </w:r>
-        <w:r>
-          <w:rPr>
-            <w:rStyle w:val="Hyperlink"/>
-            <w:rFonts w:ascii="Calibri" w:eastAsia="Calibri" w:hAnsi="Calibri" w:cs="Calibri"/>
-            <w:sz w:val="24"/>
-            <w:szCs w:val="24"/>
-          </w:rPr>
-          <w:t>nk</w:t>
+          <w:t>Link</w:t>
         </w:r>
       </w:hyperlink>
       <w:r>
@@ -690,7 +662,7 @@
         </w:rPr>
         <w:t xml:space="preserve"> | </w:t>
       </w:r>
-      <w:hyperlink r:id="rId11" w:history="1">
+      <w:hyperlink r:id="rId12" w:history="1">
         <w:r>
           <w:rPr>
             <w:rStyle w:val="Hyperlink"/>
@@ -897,23 +869,13 @@
       <w:pPr>
         <w:spacing w:after="18"/>
       </w:pPr>
-      <w:proofErr w:type="spellStart"/>
       <w:r>
         <w:rPr>
           <w:rFonts w:ascii="Calibri" w:eastAsia="Calibri" w:hAnsi="Calibri" w:cs="Calibri"/>
           <w:i/>
           <w:iCs/>
         </w:rPr>
-        <w:t>PyTorch</w:t>
-      </w:r>
-      <w:proofErr w:type="spellEnd"/>
-      <w:r>
-        <w:rPr>
-          <w:rFonts w:ascii="Calibri" w:eastAsia="Calibri" w:hAnsi="Calibri" w:cs="Calibri"/>
-          <w:i/>
-          <w:iCs/>
-        </w:rPr>
-        <w:t xml:space="preserve"> Geometric, HNN-Core</w:t>
+        <w:t>PyTorch Geometric, HNN-Core</w:t>
       </w:r>
     </w:p>
     <w:p>
@@ -2362,6 +2324,7 @@
   <w:style w:type="character" w:default="1" w:styleId="DefaultParagraphFont">
     <w:name w:val="Default Paragraph Font"/>
     <w:uiPriority w:val="1"/>
+    <w:semiHidden/>
     <w:unhideWhenUsed/>
   </w:style>
   <w:style w:type="table" w:default="1" w:styleId="TableNormal">

</xml_diff>